<commit_message>
reorganized version history of CAD housing
</commit_message>
<xml_diff>
--- a/CAD_files/Part_Dimesions.docx
+++ b/CAD_files/Part_Dimesions.docx
@@ -2,6 +2,21 @@
 <file path=word/document.xml><?xml version="1.0" encoding="utf-8"?>
 <w:document xmlns:wpc="http://schemas.microsoft.com/office/word/2010/wordprocessingCanvas" xmlns:cx="http://schemas.microsoft.com/office/drawing/2014/chartex" xmlns:cx1="http://schemas.microsoft.com/office/drawing/2015/9/8/chartex" xmlns:cx2="http://schemas.microsoft.com/office/drawing/2015/10/21/chartex" xmlns:cx3="http://schemas.microsoft.com/office/drawing/2016/5/9/chartex" xmlns:cx4="http://schemas.microsoft.com/office/drawing/2016/5/10/chartex" xmlns:cx5="http://schemas.microsoft.com/office/drawing/2016/5/11/chartex" xmlns:cx6="http://schemas.microsoft.com/office/drawing/2016/5/12/chartex" xmlns:cx7="http://schemas.microsoft.com/office/drawing/2016/5/13/chartex" xmlns:cx8="http://schemas.microsoft.com/office/drawing/2016/5/14/chartex" xmlns:mc="http://schemas.openxmlformats.org/markup-compatibility/2006" xmlns:aink="http://schemas.microsoft.com/office/drawing/2016/ink" xmlns:am3d="http://schemas.microsoft.com/office/drawing/2017/model3d" xmlns:o="urn:schemas-microsoft-com:office:office" xmlns:oel="http://schemas.microsoft.com/office/2019/extlst" xmlns:r="http://schemas.openxmlformats.org/officeDocument/2006/relationships" xmlns:m="http://schemas.openxmlformats.org/officeDocument/2006/math" xmlns:v="urn:schemas-microsoft-com:vml" xmlns:wp14="http://schemas.microsoft.com/office/word/2010/wordprocessingDrawing" xmlns:wp="http://schemas.openxmlformats.org/drawingml/2006/wordprocessingDrawing" xmlns:w10="urn:schemas-microsoft-com:office:word" xmlns:w="http://schemas.openxmlformats.org/wordprocessingml/2006/main" xmlns:w14="http://schemas.microsoft.com/office/word/2010/wordml" xmlns:w15="http://schemas.microsoft.com/office/word/2012/wordml" xmlns:w16cex="http://schemas.microsoft.com/office/word/2018/wordml/cex" xmlns:w16cid="http://schemas.microsoft.com/office/word/2016/wordml/cid" xmlns:w16="http://schemas.microsoft.com/office/word/2018/wordml" xmlns:w16du="http://schemas.microsoft.com/office/word/2023/wordml/word16du" xmlns:w16sdtdh="http://schemas.microsoft.com/office/word/2020/wordml/sdtdatahash" xmlns:w16sdtfl="http://schemas.microsoft.com/office/word/2024/wordml/sdtformatlock" xmlns:w16se="http://schemas.microsoft.com/office/word/2015/wordml/symex" xmlns:wpg="http://schemas.microsoft.com/office/word/2010/wordprocessingGroup" xmlns:wpi="http://schemas.microsoft.com/office/word/2010/wordprocessingInk" xmlns:wne="http://schemas.microsoft.com/office/word/2006/wordml" xmlns:wps="http://schemas.microsoft.com/office/word/2010/wordprocessingShape" mc:Ignorable="w14 w15 w16se w16cid w16 w16cex w16sdtdh w16sdtfl w16du wp14">
   <w:body>
+    <w:p>
+      <w:pPr>
+        <w:rPr>
+          <w:b/>
+          <w:bCs/>
+        </w:rPr>
+      </w:pPr>
+      <w:r>
+        <w:rPr>
+          <w:b/>
+          <w:bCs/>
+        </w:rPr>
+        <w:t xml:space="preserve">All other CAD files made of purchased parts were made from measuring the parts using a vernier caliper. </w:t>
+      </w:r>
+    </w:p>
     <w:p>
       <w:pPr>
         <w:rPr>
@@ -53,9 +68,9 @@
           <w:noProof/>
         </w:rPr>
         <w:drawing>
-          <wp:inline distT="0" distB="0" distL="0" distR="0" wp14:anchorId="360BF3AB" wp14:editId="68EF8A09">
-            <wp:extent cx="4995333" cy="1723817"/>
-            <wp:effectExtent l="0" t="0" r="0" b="0"/>
+          <wp:inline distT="0" distB="0" distL="0" distR="0" wp14:anchorId="360BF3AB" wp14:editId="5444ABD1">
+            <wp:extent cx="4849586" cy="1673521"/>
+            <wp:effectExtent l="0" t="0" r="8255" b="3175"/>
             <wp:docPr id="75198956" name="Picture 1"/>
             <wp:cNvGraphicFramePr>
               <a:graphicFrameLocks xmlns:a="http://schemas.openxmlformats.org/drawingml/2006/main" noChangeAspect="1"/>
@@ -85,7 +100,7 @@
                   <pic:spPr bwMode="auto">
                     <a:xfrm>
                       <a:off x="0" y="0"/>
-                      <a:ext cx="5012461" cy="1729727"/>
+                      <a:ext cx="4868906" cy="1680188"/>
                     </a:xfrm>
                     <a:prstGeom prst="rect">
                       <a:avLst/>
@@ -156,6 +171,9 @@
     </w:p>
     <w:p>
       <w:r>
+        <w:rPr>
+          <w:noProof/>
+        </w:rPr>
         <w:drawing>
           <wp:inline distT="0" distB="0" distL="0" distR="0" wp14:anchorId="0DB3A671" wp14:editId="47D39EA5">
             <wp:extent cx="4440767" cy="3093828"/>
@@ -193,8 +211,6 @@
         </w:drawing>
       </w:r>
     </w:p>
-    <w:p/>
-    <w:p/>
     <w:sectPr>
       <w:pgSz w:w="12240" w:h="15840"/>
       <w:pgMar w:top="1440" w:right="1440" w:bottom="1440" w:left="1440" w:header="708" w:footer="708" w:gutter="0"/>
@@ -808,6 +824,7 @@
   <w:style w:type="character" w:default="1" w:styleId="DefaultParagraphFont">
     <w:name w:val="Default Paragraph Font"/>
     <w:uiPriority w:val="1"/>
+    <w:semiHidden/>
     <w:unhideWhenUsed/>
   </w:style>
   <w:style w:type="table" w:default="1" w:styleId="TableNormal">

</xml_diff>